<commit_message>
Rewrite Lab 2 report in feminine voice and Lab 1 layout
Co-Authored-By: Claude Sonnet 5.5 <noreply@anthropic.com>
Claude-Session: https://claude.ai/code/session_01M8pUE3adzgGc2WqjPvNRzN
</commit_message>
<xml_diff>
--- a/Lab2/lab2_report.docx
+++ b/Lab2/lab2_report.docx
@@ -71,18 +71,17 @@
     <w:p>
       <w:pPr>
         <w:keepNext/>
-        <w:spacing w:after="120" w:before="240" w:line="360"/>
-        <w:jc w:val="center"/>
+        <w:spacing w:after="120" w:before="360" w:line="360"/>
       </w:pPr>
       <w:r>
         <w:rPr>
           <w:rFonts w:ascii="Times New Roman" w:cs="Times New Roman" w:eastAsia="Times New Roman" w:hAnsi="Times New Roman"/>
           <w:b/>
           <w:bCs/>
-          <w:sz w:val="28"/>
-          <w:szCs w:val="28"/>
+          <w:sz w:val="30"/>
+          <w:szCs w:val="30"/>
         </w:rPr>
-        <w:t xml:space="preserve">Краткие теоретические сведения</w:t>
+        <w:t xml:space="preserve">Пункт 1. Проанализируйте предметную область и выделите требования к проектированию</w:t>
       </w:r>
     </w:p>
     <w:p>
@@ -97,72 +96,7 @@
           <w:sz w:val="28"/>
           <w:szCs w:val="28"/>
         </w:rPr>
-        <w:t xml:space="preserve">Инфологический (концептуальный) уровень это первый этап проектирования базы данных. На нем я анализирую предметную область, выделяю сущности, их свойства (атрибуты) и связи между сущностями. Сущность можно считать прообразом таблицы, а атрибут прообразом столбца.</w:t>
-      </w:r>
-    </w:p>
-    <w:p>
-      <w:pPr>
-        <w:spacing w:after="0" w:before="0" w:line="360"/>
-        <w:ind w:firstLine="709"/>
-        <w:jc w:val="both"/>
-      </w:pPr>
-      <w:r>
-        <w:rPr>
-          <w:rFonts w:ascii="Times New Roman" w:cs="Times New Roman" w:eastAsia="Times New Roman" w:hAnsi="Times New Roman"/>
-          <w:sz w:val="28"/>
-          <w:szCs w:val="28"/>
-        </w:rPr>
-        <w:t xml:space="preserve">Связи между сущностями бывают трех типов: 1:1 (одной записи соответствует одна запись), 1:N (одной записи соответствует много записей) и M:N (много записей соответствуют многим). Для каждой сущности выделяют ключи: первичный (однозначно определяет запись), внешний (ссылка на первичный ключ другой сущности) и альтернативный (другой уникальный атрибут).</w:t>
-      </w:r>
-    </w:p>
-    <w:p>
-      <w:pPr>
-        <w:spacing w:after="0" w:before="0" w:line="360"/>
-        <w:ind w:firstLine="709"/>
-        <w:jc w:val="both"/>
-      </w:pPr>
-      <w:r>
-        <w:rPr>
-          <w:rFonts w:ascii="Times New Roman" w:cs="Times New Roman" w:eastAsia="Times New Roman" w:hAnsi="Times New Roman"/>
-          <w:sz w:val="28"/>
-          <w:szCs w:val="28"/>
-        </w:rPr>
-        <w:t xml:space="preserve">Модель можно описать текстом или нарисовать в виде ER-диаграммы. Диаграмма нагляднее, поэтому я выбрал ее. В работе использована нотация Мартина: сущность это прямоугольник со списком атрибутов, а тип связи показан на концах линий (одна черта это «один», «вороньи лапки» это «много»).</w:t>
-      </w:r>
-    </w:p>
-    <w:p>
-      <w:pPr>
-        <w:keepNext/>
-        <w:spacing w:after="120" w:before="240" w:line="360"/>
-        <w:jc w:val="center"/>
-      </w:pPr>
-      <w:r>
-        <w:rPr>
-          <w:rFonts w:ascii="Times New Roman" w:cs="Times New Roman" w:eastAsia="Times New Roman" w:hAnsi="Times New Roman"/>
-          <w:b/>
-          <w:bCs/>
-          <w:sz w:val="28"/>
-          <w:szCs w:val="28"/>
-        </w:rPr>
-        <w:t xml:space="preserve">Ход работы</w:t>
-      </w:r>
-    </w:p>
-    <w:p>
-      <w:pPr>
-        <w:keepNext/>
-        <w:spacing w:after="60" w:before="240" w:line="360"/>
-        <w:ind w:firstLine="709"/>
-        <w:jc w:val="both"/>
-      </w:pPr>
-      <w:r>
-        <w:rPr>
-          <w:rFonts w:ascii="Times New Roman" w:cs="Times New Roman" w:eastAsia="Times New Roman" w:hAnsi="Times New Roman"/>
-          <w:b/>
-          <w:bCs/>
-          <w:sz w:val="28"/>
-          <w:szCs w:val="28"/>
-        </w:rPr>
-        <w:t xml:space="preserve">1. Проанализируйте предметную область, сформулируйте ее письменное описание, выделите не менее пяти требований к проектированию.</w:t>
+        <w:t xml:space="preserve">Инфологический (концептуальный) уровень это первый этап проектирования базы данных: я анализирую предметную область, выделяю сущности, их атрибуты и связи между ними. Моя предметная область: онлайн-магазин.</w:t>
       </w:r>
     </w:p>
     <w:p>
@@ -303,19 +237,17 @@
     <w:p>
       <w:pPr>
         <w:keepNext/>
-        <w:spacing w:after="60" w:before="240" w:line="360"/>
-        <w:ind w:firstLine="709"/>
-        <w:jc w:val="both"/>
+        <w:spacing w:after="120" w:before="360" w:line="360"/>
       </w:pPr>
       <w:r>
         <w:rPr>
           <w:rFonts w:ascii="Times New Roman" w:cs="Times New Roman" w:eastAsia="Times New Roman" w:hAnsi="Times New Roman"/>
           <w:b/>
           <w:bCs/>
-          <w:sz w:val="28"/>
-          <w:szCs w:val="28"/>
+          <w:sz w:val="30"/>
+          <w:szCs w:val="30"/>
         </w:rPr>
-        <w:t xml:space="preserve">2. Сформируйте набор сущностей (не менее шести).</w:t>
+        <w:t xml:space="preserve">Пункт 2. Сформируйте набор сущностей</w:t>
       </w:r>
     </w:p>
     <w:p>
@@ -330,21 +262,24 @@
           <w:sz w:val="28"/>
           <w:szCs w:val="28"/>
         </w:rPr>
-        <w:t xml:space="preserve">Из описания и требований я выделил девять сущностей (таблица 1).</w:t>
+        <w:t xml:space="preserve">Сущность это прообраз будущей таблицы. Из описания и требований я выделила девять сущностей.</w:t>
       </w:r>
     </w:p>
     <w:p>
       <w:pPr>
         <w:keepNext/>
-        <w:spacing w:after="60" w:before="200" w:line="360"/>
+        <w:spacing w:after="60" w:before="120"/>
+        <w:jc w:val="center"/>
       </w:pPr>
       <w:r>
         <w:rPr>
           <w:rFonts w:ascii="Times New Roman" w:cs="Times New Roman" w:eastAsia="Times New Roman" w:hAnsi="Times New Roman"/>
-          <w:sz w:val="28"/>
-          <w:szCs w:val="28"/>
+          <w:b/>
+          <w:bCs/>
+          <w:sz w:val="26"/>
+          <w:szCs w:val="26"/>
         </w:rPr>
-        <w:t xml:space="preserve">Таблица 1 – Сущности онлайн-магазина</w:t>
+        <w:t xml:space="preserve">Сущности онлайн-магазина</w:t>
       </w:r>
     </w:p>
     <w:tbl>
@@ -1236,19 +1171,17 @@
     <w:p>
       <w:pPr>
         <w:keepNext/>
-        <w:spacing w:after="60" w:before="240" w:line="360"/>
-        <w:ind w:firstLine="709"/>
-        <w:jc w:val="both"/>
+        <w:spacing w:after="120" w:before="360" w:line="360"/>
       </w:pPr>
       <w:r>
         <w:rPr>
           <w:rFonts w:ascii="Times New Roman" w:cs="Times New Roman" w:eastAsia="Times New Roman" w:hAnsi="Times New Roman"/>
           <w:b/>
           <w:bCs/>
-          <w:sz w:val="28"/>
-          <w:szCs w:val="28"/>
+          <w:sz w:val="30"/>
+          <w:szCs w:val="30"/>
         </w:rPr>
-        <w:t xml:space="preserve">3. Для каждой сущности определите более трех атрибутов.</w:t>
+        <w:t xml:space="preserve">Пункт 3. Определите атрибуты каждой сущности</w:t>
       </w:r>
     </w:p>
     <w:p>
@@ -1263,21 +1196,24 @@
           <w:sz w:val="28"/>
           <w:szCs w:val="28"/>
         </w:rPr>
-        <w:t xml:space="preserve">Атрибуты каждой сущности приведены в таблицах 2–10. В последнем столбце сразу отмечены ключи, о них подробнее в пункте 5.</w:t>
+        <w:t xml:space="preserve">Атрибут это прообраз столбца таблицы. Атрибуты каждой сущности приведены ниже. В последнем столбце сразу отмечены ключи, о них подробнее в пункте 5.</w:t>
       </w:r>
     </w:p>
     <w:p>
       <w:pPr>
         <w:keepNext/>
-        <w:spacing w:after="60" w:before="200" w:line="360"/>
+        <w:spacing w:after="60" w:before="120"/>
+        <w:jc w:val="center"/>
       </w:pPr>
       <w:r>
         <w:rPr>
           <w:rFonts w:ascii="Times New Roman" w:cs="Times New Roman" w:eastAsia="Times New Roman" w:hAnsi="Times New Roman"/>
-          <w:sz w:val="28"/>
-          <w:szCs w:val="28"/>
+          <w:b/>
+          <w:bCs/>
+          <w:sz w:val="26"/>
+          <w:szCs w:val="26"/>
         </w:rPr>
-        <w:t xml:space="preserve">Таблица 2 – Сущность Customer (Клиент)</w:t>
+        <w:t xml:space="preserve">Сущность Customer (Клиент)</w:t>
       </w:r>
     </w:p>
     <w:tbl>
@@ -2033,15 +1969,18 @@
     <w:p>
       <w:pPr>
         <w:keepNext/>
-        <w:spacing w:after="60" w:before="200" w:line="360"/>
+        <w:spacing w:after="60" w:before="120"/>
+        <w:jc w:val="center"/>
       </w:pPr>
       <w:r>
         <w:rPr>
           <w:rFonts w:ascii="Times New Roman" w:cs="Times New Roman" w:eastAsia="Times New Roman" w:hAnsi="Times New Roman"/>
-          <w:sz w:val="28"/>
-          <w:szCs w:val="28"/>
+          <w:b/>
+          <w:bCs/>
+          <w:sz w:val="26"/>
+          <w:szCs w:val="26"/>
         </w:rPr>
-        <w:t xml:space="preserve">Таблица 3 – Сущность Category (Категория)</w:t>
+        <w:t xml:space="preserve">Сущность Category (Категория)</w:t>
       </w:r>
     </w:p>
     <w:tbl>
@@ -2483,15 +2422,18 @@
     <w:p>
       <w:pPr>
         <w:keepNext/>
-        <w:spacing w:after="60" w:before="200" w:line="360"/>
+        <w:spacing w:after="60" w:before="120"/>
+        <w:jc w:val="center"/>
       </w:pPr>
       <w:r>
         <w:rPr>
           <w:rFonts w:ascii="Times New Roman" w:cs="Times New Roman" w:eastAsia="Times New Roman" w:hAnsi="Times New Roman"/>
-          <w:sz w:val="28"/>
-          <w:szCs w:val="28"/>
+          <w:b/>
+          <w:bCs/>
+          <w:sz w:val="26"/>
+          <w:szCs w:val="26"/>
         </w:rPr>
-        <w:t xml:space="preserve">Таблица 4 – Сущность Product (Товар)</w:t>
+        <w:t xml:space="preserve">Сущность Product (Товар)</w:t>
       </w:r>
     </w:p>
     <w:tbl>
@@ -3171,15 +3113,18 @@
     <w:p>
       <w:pPr>
         <w:keepNext/>
-        <w:spacing w:after="60" w:before="200" w:line="360"/>
+        <w:spacing w:after="60" w:before="120"/>
+        <w:jc w:val="center"/>
       </w:pPr>
       <w:r>
         <w:rPr>
           <w:rFonts w:ascii="Times New Roman" w:cs="Times New Roman" w:eastAsia="Times New Roman" w:hAnsi="Times New Roman"/>
-          <w:sz w:val="28"/>
-          <w:szCs w:val="28"/>
+          <w:b/>
+          <w:bCs/>
+          <w:sz w:val="26"/>
+          <w:szCs w:val="26"/>
         </w:rPr>
-        <w:t xml:space="preserve">Таблица 5 – Сущность Order (Заказ)</w:t>
+        <w:t xml:space="preserve">Сущность Order (Заказ)</w:t>
       </w:r>
     </w:p>
     <w:tbl>
@@ -3793,15 +3738,18 @@
     <w:p>
       <w:pPr>
         <w:keepNext/>
-        <w:spacing w:after="60" w:before="200" w:line="360"/>
+        <w:spacing w:after="60" w:before="120"/>
+        <w:jc w:val="center"/>
       </w:pPr>
       <w:r>
         <w:rPr>
           <w:rFonts w:ascii="Times New Roman" w:cs="Times New Roman" w:eastAsia="Times New Roman" w:hAnsi="Times New Roman"/>
-          <w:sz w:val="28"/>
-          <w:szCs w:val="28"/>
+          <w:b/>
+          <w:bCs/>
+          <w:sz w:val="26"/>
+          <w:szCs w:val="26"/>
         </w:rPr>
-        <w:t xml:space="preserve">Таблица 6 – Сущность Order_item (Позиция заказа)</w:t>
+        <w:t xml:space="preserve">Сущность Order_item (Позиция заказа)</w:t>
       </w:r>
     </w:p>
     <w:tbl>
@@ -4243,15 +4191,18 @@
     <w:p>
       <w:pPr>
         <w:keepNext/>
-        <w:spacing w:after="60" w:before="200" w:line="360"/>
+        <w:spacing w:after="60" w:before="120"/>
+        <w:jc w:val="center"/>
       </w:pPr>
       <w:r>
         <w:rPr>
           <w:rFonts w:ascii="Times New Roman" w:cs="Times New Roman" w:eastAsia="Times New Roman" w:hAnsi="Times New Roman"/>
-          <w:sz w:val="28"/>
-          <w:szCs w:val="28"/>
+          <w:b/>
+          <w:bCs/>
+          <w:sz w:val="26"/>
+          <w:szCs w:val="26"/>
         </w:rPr>
-        <w:t xml:space="preserve">Таблица 7 – Сущность Payment_method (Способ оплаты)</w:t>
+        <w:t xml:space="preserve">Сущность Payment_method (Способ оплаты)</w:t>
       </w:r>
     </w:p>
     <w:tbl>
@@ -4693,15 +4644,18 @@
     <w:p>
       <w:pPr>
         <w:keepNext/>
-        <w:spacing w:after="60" w:before="200" w:line="360"/>
+        <w:spacing w:after="60" w:before="120"/>
+        <w:jc w:val="center"/>
       </w:pPr>
       <w:r>
         <w:rPr>
           <w:rFonts w:ascii="Times New Roman" w:cs="Times New Roman" w:eastAsia="Times New Roman" w:hAnsi="Times New Roman"/>
-          <w:sz w:val="28"/>
-          <w:szCs w:val="28"/>
+          <w:b/>
+          <w:bCs/>
+          <w:sz w:val="26"/>
+          <w:szCs w:val="26"/>
         </w:rPr>
-        <w:t xml:space="preserve">Таблица 8 – Сущность Order_status (Статус заказа)</w:t>
+        <w:t xml:space="preserve">Сущность Order_status (Статус заказа)</w:t>
       </w:r>
     </w:p>
     <w:tbl>
@@ -5143,15 +5097,18 @@
     <w:p>
       <w:pPr>
         <w:keepNext/>
-        <w:spacing w:after="60" w:before="200" w:line="360"/>
+        <w:spacing w:after="60" w:before="120"/>
+        <w:jc w:val="center"/>
       </w:pPr>
       <w:r>
         <w:rPr>
           <w:rFonts w:ascii="Times New Roman" w:cs="Times New Roman" w:eastAsia="Times New Roman" w:hAnsi="Times New Roman"/>
-          <w:sz w:val="28"/>
-          <w:szCs w:val="28"/>
+          <w:b/>
+          <w:bCs/>
+          <w:sz w:val="26"/>
+          <w:szCs w:val="26"/>
         </w:rPr>
-        <w:t xml:space="preserve">Таблица 9 – Сущность Delivery (Доставка)</w:t>
+        <w:t xml:space="preserve">Сущность Delivery (Доставка)</w:t>
       </w:r>
     </w:p>
     <w:tbl>
@@ -5755,15 +5712,18 @@
     <w:p>
       <w:pPr>
         <w:keepNext/>
-        <w:spacing w:after="60" w:before="200" w:line="360"/>
+        <w:spacing w:after="60" w:before="120"/>
+        <w:jc w:val="center"/>
       </w:pPr>
       <w:r>
         <w:rPr>
           <w:rFonts w:ascii="Times New Roman" w:cs="Times New Roman" w:eastAsia="Times New Roman" w:hAnsi="Times New Roman"/>
-          <w:sz w:val="28"/>
-          <w:szCs w:val="28"/>
+          <w:b/>
+          <w:bCs/>
+          <w:sz w:val="26"/>
+          <w:szCs w:val="26"/>
         </w:rPr>
-        <w:t xml:space="preserve">Таблица 10 – Сущность Review (Отзыв)</w:t>
+        <w:t xml:space="preserve">Сущность Review (Отзыв)</w:t>
       </w:r>
     </w:p>
     <w:tbl>
@@ -6367,19 +6327,17 @@
     <w:p>
       <w:pPr>
         <w:keepNext/>
-        <w:spacing w:after="60" w:before="240" w:line="360"/>
-        <w:ind w:firstLine="709"/>
-        <w:jc w:val="both"/>
+        <w:spacing w:after="120" w:before="360" w:line="360"/>
       </w:pPr>
       <w:r>
         <w:rPr>
           <w:rFonts w:ascii="Times New Roman" w:cs="Times New Roman" w:eastAsia="Times New Roman" w:hAnsi="Times New Roman"/>
           <w:b/>
           <w:bCs/>
-          <w:sz w:val="28"/>
-          <w:szCs w:val="28"/>
+          <w:sz w:val="30"/>
+          <w:szCs w:val="30"/>
         </w:rPr>
-        <w:t xml:space="preserve">4. Сформируйте все типы связей между сущностями.</w:t>
+        <w:t xml:space="preserve">Пункт 4. Сформируйте все типы связей между сущностями</w:t>
       </w:r>
     </w:p>
     <w:p>
@@ -6394,21 +6352,24 @@
           <w:sz w:val="28"/>
           <w:szCs w:val="28"/>
         </w:rPr>
-        <w:t xml:space="preserve">Я нашел связи всех трех типов: 1:1, 1:N и M:N (таблица 11). Связь M:N нельзя хранить напрямую, поэтому она раскладывается на две связи 1:N через дополнительную сущность.</w:t>
+        <w:t xml:space="preserve">Связи бывают трех типов: 1:1 (одной записи соответствует одна запись), 1:N (одной записи соответствует много записей) и M:N (много записей соответствуют многим). Я нашла связи всех трех типов. Связь M:N нельзя хранить напрямую, поэтому она раскладывается на две связи 1:N через дополнительную сущность.</w:t>
       </w:r>
     </w:p>
     <w:p>
       <w:pPr>
         <w:keepNext/>
-        <w:spacing w:after="60" w:before="200" w:line="360"/>
+        <w:spacing w:after="60" w:before="120"/>
+        <w:jc w:val="center"/>
       </w:pPr>
       <w:r>
         <w:rPr>
           <w:rFonts w:ascii="Times New Roman" w:cs="Times New Roman" w:eastAsia="Times New Roman" w:hAnsi="Times New Roman"/>
-          <w:sz w:val="28"/>
-          <w:szCs w:val="28"/>
+          <w:b/>
+          <w:bCs/>
+          <w:sz w:val="26"/>
+          <w:szCs w:val="26"/>
         </w:rPr>
-        <w:t xml:space="preserve">Таблица 11 – Связи между сущностями</w:t>
+        <w:t xml:space="preserve">Связи между сущностями</w:t>
       </w:r>
     </w:p>
     <w:tbl>
@@ -7458,19 +7419,17 @@
     <w:p>
       <w:pPr>
         <w:keepNext/>
-        <w:spacing w:after="60" w:before="240" w:line="360"/>
-        <w:ind w:firstLine="709"/>
-        <w:jc w:val="both"/>
+        <w:spacing w:after="120" w:before="360" w:line="360"/>
       </w:pPr>
       <w:r>
         <w:rPr>
           <w:rFonts w:ascii="Times New Roman" w:cs="Times New Roman" w:eastAsia="Times New Roman" w:hAnsi="Times New Roman"/>
           <w:b/>
           <w:bCs/>
-          <w:sz w:val="28"/>
-          <w:szCs w:val="28"/>
+          <w:sz w:val="30"/>
+          <w:szCs w:val="30"/>
         </w:rPr>
-        <w:t xml:space="preserve">5. Сформируйте различные виды ключей, опишите, какие атрибуты могли бы стать тем или иным видом ключа. Укажите альтернативные ключи.</w:t>
+        <w:t xml:space="preserve">Пункт 5. Сформируйте виды ключей и укажите альтернативные ключи</w:t>
       </w:r>
     </w:p>
     <w:p>
@@ -7485,21 +7444,24 @@
           <w:sz w:val="28"/>
           <w:szCs w:val="28"/>
         </w:rPr>
-        <w:t xml:space="preserve">Первичные ключи показаны в таблице 12. Для большинства сущностей я взял искусственный ключ id, потому что он не меняется. Для Payment_method подошел естественный простой ключ code, так как коды способов оплаты короткие и постоянные. В Order_item естественный составной ключ из двух атрибутов: в заказе один и тот же товар встречается один раз, а одного id_order или одного id_product для однозначного поиска мало.</w:t>
+        <w:t xml:space="preserve">Первичный ключ однозначно определяет запись. Для большинства сущностей я взяла искусственный ключ id, потому что он не меняется. Для Payment_method подошел естественный простой ключ code, так как коды способов оплаты короткие и постоянные. В Order_item естественный составной ключ из двух атрибутов: в заказе один и тот же товар встречается один раз, а одного id_order или одного id_product для однозначного поиска мало.</w:t>
       </w:r>
     </w:p>
     <w:p>
       <w:pPr>
         <w:keepNext/>
-        <w:spacing w:after="60" w:before="200" w:line="360"/>
+        <w:spacing w:after="60" w:before="120"/>
+        <w:jc w:val="center"/>
       </w:pPr>
       <w:r>
         <w:rPr>
           <w:rFonts w:ascii="Times New Roman" w:cs="Times New Roman" w:eastAsia="Times New Roman" w:hAnsi="Times New Roman"/>
-          <w:sz w:val="28"/>
-          <w:szCs w:val="28"/>
+          <w:b/>
+          <w:bCs/>
+          <w:sz w:val="26"/>
+          <w:szCs w:val="26"/>
         </w:rPr>
-        <w:t xml:space="preserve">Таблица 12 – Первичные ключи</w:t>
+        <w:t xml:space="preserve">Первичные ключи</w:t>
       </w:r>
     </w:p>
     <w:tbl>
@@ -8400,21 +8362,24 @@
           <w:sz w:val="28"/>
           <w:szCs w:val="28"/>
         </w:rPr>
-        <w:t xml:space="preserve">Внешние ключи показаны в таблице 13. Ключ id_parent в Category ссылается на id_category этой же сущности, то есть это рекурсивный ключ.</w:t>
+        <w:t xml:space="preserve">Внешний ключ это ссылка на первичный ключ другой сущности. Ключ id_parent в Category ссылается на id_category этой же сущности, то есть это рекурсивный ключ.</w:t>
       </w:r>
     </w:p>
     <w:p>
       <w:pPr>
         <w:keepNext/>
-        <w:spacing w:after="60" w:before="200" w:line="360"/>
+        <w:spacing w:after="60" w:before="120"/>
+        <w:jc w:val="center"/>
       </w:pPr>
       <w:r>
         <w:rPr>
           <w:rFonts w:ascii="Times New Roman" w:cs="Times New Roman" w:eastAsia="Times New Roman" w:hAnsi="Times New Roman"/>
-          <w:sz w:val="28"/>
-          <w:szCs w:val="28"/>
+          <w:b/>
+          <w:bCs/>
+          <w:sz w:val="26"/>
+          <w:szCs w:val="26"/>
         </w:rPr>
-        <w:t xml:space="preserve">Таблица 13 – Внешние ключи</w:t>
+        <w:t xml:space="preserve">Внешние ключи</w:t>
       </w:r>
     </w:p>
     <w:tbl>
@@ -9401,21 +9366,24 @@
           <w:sz w:val="28"/>
           <w:szCs w:val="28"/>
         </w:rPr>
-        <w:t xml:space="preserve">Альтернативные ключи это уникальные атрибуты, которые не стали первичными (таблица 14). Например, email мог бы быть естественным первичным ключом клиента, но я не выбрал его, потому что адрес почты может измениться, и его пришлось бы менять во всех связанных таблицах.</w:t>
+        <w:t xml:space="preserve">Альтернативные ключи это уникальные атрибуты, которые не стали первичными. Например, email мог бы быть естественным первичным ключом клиента, но я не выбрала его, потому что адрес почты может измениться, и его пришлось бы менять во всех связанных таблицах.</w:t>
       </w:r>
     </w:p>
     <w:p>
       <w:pPr>
         <w:keepNext/>
-        <w:spacing w:after="60" w:before="200" w:line="360"/>
+        <w:spacing w:after="60" w:before="120"/>
+        <w:jc w:val="center"/>
       </w:pPr>
       <w:r>
         <w:rPr>
           <w:rFonts w:ascii="Times New Roman" w:cs="Times New Roman" w:eastAsia="Times New Roman" w:hAnsi="Times New Roman"/>
-          <w:sz w:val="28"/>
-          <w:szCs w:val="28"/>
+          <w:b/>
+          <w:bCs/>
+          <w:sz w:val="26"/>
+          <w:szCs w:val="26"/>
         </w:rPr>
-        <w:t xml:space="preserve">Таблица 14 – Альтернативные ключи</w:t>
+        <w:t xml:space="preserve">Альтернативные ключи</w:t>
       </w:r>
     </w:p>
     <w:tbl>
@@ -9811,19 +9779,17 @@
     <w:p>
       <w:pPr>
         <w:keepNext/>
-        <w:spacing w:after="60" w:before="240" w:line="360"/>
-        <w:ind w:firstLine="709"/>
-        <w:jc w:val="both"/>
+        <w:spacing w:after="120" w:before="360" w:line="360"/>
       </w:pPr>
       <w:r>
         <w:rPr>
           <w:rFonts w:ascii="Times New Roman" w:cs="Times New Roman" w:eastAsia="Times New Roman" w:hAnsi="Times New Roman"/>
           <w:b/>
           <w:bCs/>
-          <w:sz w:val="28"/>
-          <w:szCs w:val="28"/>
+          <w:sz w:val="30"/>
+          <w:szCs w:val="30"/>
         </w:rPr>
-        <w:t xml:space="preserve">6. Постройте инфологическую модель (ER-модель) предметной области.</w:t>
+        <w:t xml:space="preserve">Пункт 6. Постройте инфологическую модель (ER-модель)</w:t>
       </w:r>
     </w:p>
     <w:p>
@@ -9838,7 +9804,7 @@
           <w:sz w:val="28"/>
           <w:szCs w:val="28"/>
         </w:rPr>
-        <w:t xml:space="preserve">ER-диаграмма онлайн-магазина построена в нотации Мартина (рисунок 1). На ней показаны все девять сущностей, их атрибуты, ключи и связи.</w:t>
+        <w:t xml:space="preserve">Модель можно описать текстом или нарисовать в виде ER-диаграммы, диаграмма нагляднее. Я использовала нотацию Мартина: сущность это прямоугольник со списком атрибутов, на концах линий показан тип связи (одна черта это «один», «вороньи лапки» это «много»). На диаграмме (рисунок 1) показаны все девять сущностей, их атрибуты, ключи и связи.</w:t>
       </w:r>
     </w:p>
     <w:p>
@@ -9915,18 +9881,17 @@
     <w:p>
       <w:pPr>
         <w:keepNext/>
-        <w:spacing w:after="120" w:before="240" w:line="360"/>
-        <w:jc w:val="center"/>
+        <w:spacing w:after="120" w:before="360" w:line="360"/>
       </w:pPr>
       <w:r>
         <w:rPr>
           <w:rFonts w:ascii="Times New Roman" w:cs="Times New Roman" w:eastAsia="Times New Roman" w:hAnsi="Times New Roman"/>
           <w:b/>
           <w:bCs/>
-          <w:sz w:val="28"/>
-          <w:szCs w:val="28"/>
+          <w:sz w:val="30"/>
+          <w:szCs w:val="30"/>
         </w:rPr>
-        <w:t xml:space="preserve">Выводы</w:t>
+        <w:t xml:space="preserve">Вывод</w:t>
       </w:r>
     </w:p>
     <w:p>
@@ -9941,7 +9906,7 @@
           <w:sz w:val="28"/>
           <w:szCs w:val="28"/>
         </w:rPr>
-        <w:t xml:space="preserve">В ходе работы я познакомился с инфологическим уровнем проектирования баз данных и разработал модель для предметной области «Онлайн-магазин». По описанию я выделил семь требований, девять сущностей и для каждой определил от четырех до восьми атрибутов.</w:t>
+        <w:t xml:space="preserve">В ходе работы я познакомилась с инфологическим уровнем проектирования баз данных и разработала модель для предметной области «Онлайн-магазин». По описанию я выделила семь требований, девять сущностей и для каждой определил от четырех до восьми атрибутов.</w:t>
       </w:r>
     </w:p>
     <w:p>
@@ -9956,7 +9921,7 @@
           <w:sz w:val="28"/>
           <w:szCs w:val="28"/>
         </w:rPr>
-        <w:t xml:space="preserve">В модели есть связи всех трех типов: 1:1 (Order и Delivery), 1:N (например, Customer и Order) и M:N (Order и Product, Customer и Product). Связи M:N я раскладывал на две связи 1:N через сущности Order_item и Review. Отдельно получилась рекурсивная связь в Category.</w:t>
+        <w:t xml:space="preserve">В модели есть связи всех трех типов: 1:1 (Order и Delivery), 1:N (например, Customer и Order) и M:N (Order и Product, Customer и Product). Связи M:N я разложила на две связи 1:N через сущности Order_item и Review. Отдельно получилась рекурсивная связь в Category.</w:t>
       </w:r>
     </w:p>
     <w:p>
@@ -9971,7 +9936,7 @@
           <w:sz w:val="28"/>
           <w:szCs w:val="28"/>
         </w:rPr>
-        <w:t xml:space="preserve">Для сущностей я подобрал ключи разных видов: искусственные простые, естественный простой (Payment_method.code) и естественный составной (Order_item), а также внешние и альтернативные ключи. По итогам все это изображено на ER-диаграмме.</w:t>
+        <w:t xml:space="preserve">Для сущностей я подобрала ключи разных видов: искусственные простые, естественный простой (Payment_method.code) и естественный составной (Order_item), а также внешние и альтернативные ключи. По итогам все это изображено на ER-диаграмме.</w:t>
       </w:r>
     </w:p>
     <w:sectPr>

</xml_diff>

<commit_message>
Make Lab 2 ER diagram portrait so it fits the page without cropping
Co-Authored-By: Claude Sonnet 5.5 <noreply@anthropic.com>
Claude-Session: https://claude.ai/code/session_01M8pUE3adzgGc2WqjPvNRzN
</commit_message>
<xml_diff>
--- a/Lab2/lab2_report.docx
+++ b/Lab2/lab2_report.docx
@@ -9767,17 +9767,6 @@
     </w:p>
     <w:p>
       <w:pPr>
-        <w:sectPr>
-          <w:footerReference w:type="default" r:id="rId7"/>
-          <w:pgSz w:w="11906" w:h="16838" w:orient="portrait"/>
-          <w:pgMar w:top="1134" w:right="850" w:bottom="1134" w:left="1701" w:header="708" w:footer="567" w:gutter="0"/>
-          <w:pgNumType/>
-          <w:docGrid w:linePitch="360"/>
-        </w:sectPr>
-      </w:pPr>
-    </w:p>
-    <w:p>
-      <w:pPr>
         <w:keepNext/>
         <w:spacing w:after="120" w:before="360" w:line="360"/>
       </w:pPr>
@@ -9809,13 +9798,14 @@
     </w:p>
     <w:p>
       <w:pPr>
+        <w:keepNext/>
         <w:spacing w:after="60" w:before="60"/>
         <w:jc w:val="center"/>
       </w:pPr>
       <w:r>
         <w:drawing>
           <wp:inline distT="0" distB="0" distL="0" distR="0">
-            <wp:extent cx="9525000" cy="4486275"/>
+            <wp:extent cx="5429250" cy="5705475"/>
             <wp:effectExtent t="0" r="0" b="0" l="0"/>
             <wp:docPr id="1" name="" descr="" title=""/>
             <wp:cNvGraphicFramePr>
@@ -9831,7 +9821,7 @@
                     </pic:cNvPicPr>
                   </pic:nvPicPr>
                   <pic:blipFill>
-                    <a:blip r:embed="rId10" cstate="none"/>
+                    <a:blip r:embed="rId8" cstate="none"/>
                     <a:srcRect/>
                     <a:stretch>
                       <a:fillRect/>
@@ -9840,7 +9830,7 @@
                   <pic:spPr bwMode="auto">
                     <a:xfrm>
                       <a:off x="0" y="0"/>
-                      <a:ext cx="9525000" cy="4486275"/>
+                      <a:ext cx="5429250" cy="5705475"/>
                     </a:xfrm>
                     <a:prstGeom prst="rect">
                       <a:avLst/>
@@ -9866,17 +9856,6 @@
         </w:rPr>
         <w:t xml:space="preserve">Рисунок 1 – ER-диаграмма онлайн-магазина</w:t>
       </w:r>
-    </w:p>
-    <w:p>
-      <w:pPr>
-        <w:sectPr>
-          <w:footerReference w:type="default" r:id="rId8"/>
-          <w:pgSz w:w="16838" w:h="11906" w:orient="landscape"/>
-          <w:pgMar w:top="567" w:right="567" w:bottom="850" w:left="567" w:header="708" w:footer="300" w:gutter="0"/>
-          <w:pgNumType/>
-          <w:docGrid w:linePitch="360"/>
-        </w:sectPr>
-      </w:pPr>
     </w:p>
     <w:p>
       <w:pPr>
@@ -9940,7 +9919,7 @@
       </w:r>
     </w:p>
     <w:sectPr>
-      <w:footerReference w:type="default" r:id="rId9"/>
+      <w:footerReference w:type="default" r:id="rId7"/>
       <w:pgSz w:w="11906" w:h="16838" w:orient="portrait"/>
       <w:pgMar w:top="1134" w:right="850" w:bottom="1134" w:left="1701" w:header="708" w:footer="567" w:gutter="0"/>
       <w:pgNumType/>
@@ -9992,48 +9971,6 @@
 </file>
 
 <file path=word/footer1.xml><?xml version="1.0" encoding="utf-8"?>
-<w:ftr xmlns:wpc="http://schemas.microsoft.com/office/word/2010/wordprocessingCanvas" xmlns:mc="http://schemas.openxmlformats.org/markup-compatibility/2006" xmlns:o="urn:schemas-microsoft-com:office:office" xmlns:r="http://schemas.openxmlformats.org/officeDocument/2006/relationships" xmlns:m="http://schemas.openxmlformats.org/officeDocument/2006/math" xmlns:v="urn:schemas-microsoft-com:vml" xmlns:wp14="http://schemas.microsoft.com/office/word/2010/wordprocessingDrawing" xmlns:wp="http://schemas.openxmlformats.org/drawingml/2006/wordprocessingDrawing" xmlns:w10="urn:schemas-microsoft-com:office:word" xmlns:w="http://schemas.openxmlformats.org/wordprocessingml/2006/main" xmlns:w14="http://schemas.microsoft.com/office/word/2010/wordml" xmlns:w15="http://schemas.microsoft.com/office/word/2012/wordml" xmlns:wpg="http://schemas.microsoft.com/office/word/2010/wordprocessingGroup" xmlns:wpi="http://schemas.microsoft.com/office/word/2010/wordprocessingInk" xmlns:wne="http://schemas.microsoft.com/office/word/2006/wordml" xmlns:wps="http://schemas.microsoft.com/office/word/2010/wordprocessingShape">
-  <w:p>
-    <w:pPr>
-      <w:jc w:val="center"/>
-    </w:pPr>
-    <w:r>
-      <w:rPr>
-        <w:rFonts w:ascii="Times New Roman" w:cs="Times New Roman" w:eastAsia="Times New Roman" w:hAnsi="Times New Roman"/>
-        <w:sz w:val="28"/>
-        <w:szCs w:val="28"/>
-      </w:rPr>
-      <w:fldChar w:fldCharType="begin"/>
-      <w:instrText xml:space="preserve">PAGE</w:instrText>
-      <w:fldChar w:fldCharType="separate"/>
-      <w:fldChar w:fldCharType="end"/>
-    </w:r>
-  </w:p>
-</w:ftr>
-</file>
-
-<file path=word/footer2.xml><?xml version="1.0" encoding="utf-8"?>
-<w:ftr xmlns:wpc="http://schemas.microsoft.com/office/word/2010/wordprocessingCanvas" xmlns:mc="http://schemas.openxmlformats.org/markup-compatibility/2006" xmlns:o="urn:schemas-microsoft-com:office:office" xmlns:r="http://schemas.openxmlformats.org/officeDocument/2006/relationships" xmlns:m="http://schemas.openxmlformats.org/officeDocument/2006/math" xmlns:v="urn:schemas-microsoft-com:vml" xmlns:wp14="http://schemas.microsoft.com/office/word/2010/wordprocessingDrawing" xmlns:wp="http://schemas.openxmlformats.org/drawingml/2006/wordprocessingDrawing" xmlns:w10="urn:schemas-microsoft-com:office:word" xmlns:w="http://schemas.openxmlformats.org/wordprocessingml/2006/main" xmlns:w14="http://schemas.microsoft.com/office/word/2010/wordml" xmlns:w15="http://schemas.microsoft.com/office/word/2012/wordml" xmlns:wpg="http://schemas.microsoft.com/office/word/2010/wordprocessingGroup" xmlns:wpi="http://schemas.microsoft.com/office/word/2010/wordprocessingInk" xmlns:wne="http://schemas.microsoft.com/office/word/2006/wordml" xmlns:wps="http://schemas.microsoft.com/office/word/2010/wordprocessingShape">
-  <w:p>
-    <w:pPr>
-      <w:jc w:val="center"/>
-    </w:pPr>
-    <w:r>
-      <w:rPr>
-        <w:rFonts w:ascii="Times New Roman" w:cs="Times New Roman" w:eastAsia="Times New Roman" w:hAnsi="Times New Roman"/>
-        <w:sz w:val="28"/>
-        <w:szCs w:val="28"/>
-      </w:rPr>
-      <w:fldChar w:fldCharType="begin"/>
-      <w:instrText xml:space="preserve">PAGE</w:instrText>
-      <w:fldChar w:fldCharType="separate"/>
-      <w:fldChar w:fldCharType="end"/>
-    </w:r>
-  </w:p>
-</w:ftr>
-</file>
-
-<file path=word/footer3.xml><?xml version="1.0" encoding="utf-8"?>
 <w:ftr xmlns:wpc="http://schemas.microsoft.com/office/word/2010/wordprocessingCanvas" xmlns:mc="http://schemas.openxmlformats.org/markup-compatibility/2006" xmlns:o="urn:schemas-microsoft-com:office:office" xmlns:r="http://schemas.openxmlformats.org/officeDocument/2006/relationships" xmlns:m="http://schemas.openxmlformats.org/officeDocument/2006/math" xmlns:v="urn:schemas-microsoft-com:vml" xmlns:wp14="http://schemas.microsoft.com/office/word/2010/wordprocessingDrawing" xmlns:wp="http://schemas.openxmlformats.org/drawingml/2006/wordprocessingDrawing" xmlns:w10="urn:schemas-microsoft-com:office:word" xmlns:w="http://schemas.openxmlformats.org/wordprocessingml/2006/main" xmlns:w14="http://schemas.microsoft.com/office/word/2010/wordml" xmlns:w15="http://schemas.microsoft.com/office/word/2012/wordml" xmlns:wpg="http://schemas.microsoft.com/office/word/2010/wordprocessingGroup" xmlns:wpi="http://schemas.microsoft.com/office/word/2010/wordprocessingInk" xmlns:wne="http://schemas.microsoft.com/office/word/2006/wordml" xmlns:wps="http://schemas.microsoft.com/office/word/2010/wordprocessingShape">
   <w:p>
     <w:pPr>

</xml_diff>